<commit_message>
markers.docx: tag sheet as printed 2026-09-23
Co-Authored-By: Claude Opus 5.5 <noreply@anthropic.com>
</commit_message>
<xml_diff>
--- a/docs/markers.docx
+++ b/docs/markers.docx
@@ -3,6 +3,528 @@
 <w:document xmlns:wpc="http://schemas.microsoft.com/office/word/2010/wordprocessingCanvas" xmlns:cx="http://schemas.microsoft.com/office/drawing/2014/chartex" xmlns:cx1="http://schemas.microsoft.com/office/drawing/2015/9/8/chartex" xmlns:cx2="http://schemas.microsoft.com/office/drawing/2015/10/21/chartex" xmlns:cx3="http://schemas.microsoft.com/office/drawing/2016/5/9/chartex" xmlns:cx4="http://schemas.microsoft.com/office/drawing/2016/5/10/chartex" xmlns:cx5="http://schemas.microsoft.com/office/drawing/2016/5/11/chartex" xmlns:cx6="http://schemas.microsoft.com/office/drawing/2016/5/12/chartex" xmlns:cx7="http://schemas.microsoft.com/office/drawing/2016/5/13/chartex" xmlns:cx8="http://schemas.microsoft.com/office/drawing/2016/5/14/chartex" xmlns:mc="http://schemas.openxmlformats.org/markup-compatibility/2006" xmlns:aink="http://schemas.microsoft.com/office/drawing/2016/ink" xmlns:am3d="http://schemas.microsoft.com/office/drawing/2017/model3d" xmlns:o="urn:schemas-microsoft-com:office:office" xmlns:oel="http://schemas.microsoft.com/office/2019/extlst" xmlns:r="http://schemas.openxmlformats.org/officeDocument/2006/relationships" xmlns:m="http://schemas.openxmlformats.org/officeDocument/2006/math" xmlns:v="urn:schemas-microsoft-com:vml" xmlns:wp14="http://schemas.microsoft.com/office/word/2010/wordprocessingDrawing" xmlns:wp="http://schemas.openxmlformats.org/drawingml/2006/wordprocessingDrawing" xmlns:w10="urn:schemas-microsoft-com:office:word" xmlns:w="http://schemas.openxmlformats.org/wordprocessingml/2006/main" xmlns:w14="http://schemas.microsoft.com/office/word/2010/wordml" xmlns:w15="http://schemas.microsoft.com/office/word/2012/wordml" xmlns:w16cex="http://schemas.microsoft.com/office/word/2018/wordml/cex" xmlns:w16cid="http://schemas.microsoft.com/office/word/2016/wordml/cid" xmlns:w16="http://schemas.microsoft.com/office/word/2018/wordml" xmlns:w16du="http://schemas.microsoft.com/office/word/2023/wordml/word16du" xmlns:w16sdtdh="http://schemas.microsoft.com/office/word/2020/wordml/sdtdatahash" xmlns:w16sdtfl="http://schemas.microsoft.com/office/word/2024/wordml/sdtformatlock" xmlns:w16se="http://schemas.microsoft.com/office/word/2015/wordml/symex" xmlns:wpg="http://schemas.microsoft.com/office/word/2010/wordprocessingGroup" xmlns:wpi="http://schemas.microsoft.com/office/word/2010/wordprocessingInk" xmlns:wne="http://schemas.microsoft.com/office/word/2006/wordml" xmlns:wps="http://schemas.microsoft.com/office/word/2010/wordprocessingShape" mc:Ignorable="w14 w15 w16se w16cid w16 w16cex w16sdtdh w16sdtfl w16du wp14">
   <w:body>
     <w:p>
+      <w:r>
+        <w:rPr>
+          <w:noProof/>
+        </w:rPr>
+        <w:drawing>
+          <wp:anchor distT="0" distB="0" distL="114300" distR="114300" simplePos="0" relativeHeight="251664384" behindDoc="0" locked="0" layoutInCell="1" allowOverlap="1" wp14:anchorId="08BC9B04" wp14:editId="24D3A6BD">
+            <wp:simplePos x="0" y="0"/>
+            <wp:positionH relativeFrom="column">
+              <wp:posOffset>800100</wp:posOffset>
+            </wp:positionH>
+            <wp:positionV relativeFrom="paragraph">
+              <wp:posOffset>4581525</wp:posOffset>
+            </wp:positionV>
+            <wp:extent cx="1800000" cy="1800000"/>
+            <wp:effectExtent l="0" t="0" r="0" b="0"/>
+            <wp:wrapNone/>
+            <wp:docPr id="630145519" name="Picture 2"/>
+            <wp:cNvGraphicFramePr>
+              <a:graphicFrameLocks xmlns:a="http://schemas.openxmlformats.org/drawingml/2006/main" noChangeAspect="1"/>
+            </wp:cNvGraphicFramePr>
+            <a:graphic xmlns:a="http://schemas.openxmlformats.org/drawingml/2006/main">
+              <a:graphicData uri="http://schemas.openxmlformats.org/drawingml/2006/picture">
+                <pic:pic xmlns:pic="http://schemas.openxmlformats.org/drawingml/2006/picture">
+                  <pic:nvPicPr>
+                    <pic:cNvPr id="630145519" name="Picture 2"/>
+                    <pic:cNvPicPr/>
+                  </pic:nvPicPr>
+                  <pic:blipFill>
+                    <a:blip r:embed="rId5"/>
+                    <a:stretch>
+                      <a:fillRect/>
+                    </a:stretch>
+                  </pic:blipFill>
+                  <pic:spPr>
+                    <a:xfrm>
+                      <a:off x="0" y="0"/>
+                      <a:ext cx="1800000" cy="1800000"/>
+                    </a:xfrm>
+                    <a:prstGeom prst="rect">
+                      <a:avLst/>
+                    </a:prstGeom>
+                  </pic:spPr>
+                </pic:pic>
+              </a:graphicData>
+            </a:graphic>
+            <wp14:sizeRelH relativeFrom="page">
+              <wp14:pctWidth>0</wp14:pctWidth>
+            </wp14:sizeRelH>
+            <wp14:sizeRelV relativeFrom="page">
+              <wp14:pctHeight>0</wp14:pctHeight>
+            </wp14:sizeRelV>
+          </wp:anchor>
+        </w:drawing>
+      </w:r>
+      <w:r>
+        <w:rPr>
+          <w:noProof/>
+        </w:rPr>
+        <w:drawing>
+          <wp:anchor distT="0" distB="0" distL="114300" distR="114300" simplePos="0" relativeHeight="251665408" behindDoc="0" locked="0" layoutInCell="1" allowOverlap="1" wp14:anchorId="004C9B95" wp14:editId="4D17E09D">
+            <wp:simplePos x="0" y="0"/>
+            <wp:positionH relativeFrom="column">
+              <wp:posOffset>6438265</wp:posOffset>
+            </wp:positionH>
+            <wp:positionV relativeFrom="paragraph">
+              <wp:posOffset>2323147</wp:posOffset>
+            </wp:positionV>
+            <wp:extent cx="1800000" cy="1800000"/>
+            <wp:effectExtent l="0" t="0" r="0" b="0"/>
+            <wp:wrapNone/>
+            <wp:docPr id="303302034" name="Picture 3" descr="The image depicts a simple, abstract geometric pattern with intersecting lines and white shapes.&#10;&#10;AI-generated content may be incorrect."/>
+            <wp:cNvGraphicFramePr>
+              <a:graphicFrameLocks xmlns:a="http://schemas.openxmlformats.org/drawingml/2006/main" noChangeAspect="1"/>
+            </wp:cNvGraphicFramePr>
+            <a:graphic xmlns:a="http://schemas.openxmlformats.org/drawingml/2006/main">
+              <a:graphicData uri="http://schemas.openxmlformats.org/drawingml/2006/picture">
+                <pic:pic xmlns:pic="http://schemas.openxmlformats.org/drawingml/2006/picture">
+                  <pic:nvPicPr>
+                    <pic:cNvPr id="303302034" name="Picture 3" descr="The image depicts a simple, abstract geometric pattern with intersecting lines and white shapes.&#10;&#10;AI-generated content may be incorrect."/>
+                    <pic:cNvPicPr/>
+                  </pic:nvPicPr>
+                  <pic:blipFill>
+                    <a:blip r:embed="rId6"/>
+                    <a:stretch>
+                      <a:fillRect/>
+                    </a:stretch>
+                  </pic:blipFill>
+                  <pic:spPr>
+                    <a:xfrm>
+                      <a:off x="0" y="0"/>
+                      <a:ext cx="1800000" cy="1800000"/>
+                    </a:xfrm>
+                    <a:prstGeom prst="rect">
+                      <a:avLst/>
+                    </a:prstGeom>
+                  </pic:spPr>
+                </pic:pic>
+              </a:graphicData>
+            </a:graphic>
+            <wp14:sizeRelH relativeFrom="page">
+              <wp14:pctWidth>0</wp14:pctWidth>
+            </wp14:sizeRelH>
+            <wp14:sizeRelV relativeFrom="page">
+              <wp14:pctHeight>0</wp14:pctHeight>
+            </wp14:sizeRelV>
+          </wp:anchor>
+        </w:drawing>
+      </w:r>
+      <w:r>
+        <w:rPr>
+          <w:noProof/>
+        </w:rPr>
+        <w:drawing>
+          <wp:anchor distT="0" distB="0" distL="114300" distR="114300" simplePos="0" relativeHeight="251663360" behindDoc="0" locked="0" layoutInCell="1" allowOverlap="1" wp14:anchorId="618C7B7B" wp14:editId="17CD145B">
+            <wp:simplePos x="0" y="0"/>
+            <wp:positionH relativeFrom="column">
+              <wp:posOffset>4028440</wp:posOffset>
+            </wp:positionH>
+            <wp:positionV relativeFrom="paragraph">
+              <wp:posOffset>2323465</wp:posOffset>
+            </wp:positionV>
+            <wp:extent cx="1800000" cy="1800000"/>
+            <wp:effectExtent l="0" t="0" r="0" b="0"/>
+            <wp:wrapNone/>
+            <wp:docPr id="1936521166" name="Picture 1" descr="F&#10;&#10;AI-generated content may be incorrect."/>
+            <wp:cNvGraphicFramePr>
+              <a:graphicFrameLocks xmlns:a="http://schemas.openxmlformats.org/drawingml/2006/main" noChangeAspect="1"/>
+            </wp:cNvGraphicFramePr>
+            <a:graphic xmlns:a="http://schemas.openxmlformats.org/drawingml/2006/main">
+              <a:graphicData uri="http://schemas.openxmlformats.org/drawingml/2006/picture">
+                <pic:pic xmlns:pic="http://schemas.openxmlformats.org/drawingml/2006/picture">
+                  <pic:nvPicPr>
+                    <pic:cNvPr id="1936521166" name="Picture 1" descr="F&#10;&#10;AI-generated content may be incorrect."/>
+                    <pic:cNvPicPr/>
+                  </pic:nvPicPr>
+                  <pic:blipFill>
+                    <a:blip r:embed="rId7"/>
+                    <a:stretch>
+                      <a:fillRect/>
+                    </a:stretch>
+                  </pic:blipFill>
+                  <pic:spPr>
+                    <a:xfrm>
+                      <a:off x="0" y="0"/>
+                      <a:ext cx="1800000" cy="1800000"/>
+                    </a:xfrm>
+                    <a:prstGeom prst="rect">
+                      <a:avLst/>
+                    </a:prstGeom>
+                  </pic:spPr>
+                </pic:pic>
+              </a:graphicData>
+            </a:graphic>
+            <wp14:sizeRelH relativeFrom="page">
+              <wp14:pctWidth>0</wp14:pctWidth>
+            </wp14:sizeRelH>
+            <wp14:sizeRelV relativeFrom="page">
+              <wp14:pctHeight>0</wp14:pctHeight>
+            </wp14:sizeRelV>
+          </wp:anchor>
+        </w:drawing>
+      </w:r>
+      <w:r>
+        <w:rPr>
+          <w:noProof/>
+        </w:rPr>
+        <w:drawing>
+          <wp:anchor distT="0" distB="0" distL="114300" distR="114300" simplePos="0" relativeHeight="251658240" behindDoc="0" locked="0" layoutInCell="1" allowOverlap="1" wp14:anchorId="45D0C538" wp14:editId="37FAE135">
+            <wp:simplePos x="0" y="0"/>
+            <wp:positionH relativeFrom="column">
+              <wp:posOffset>1642428</wp:posOffset>
+            </wp:positionH>
+            <wp:positionV relativeFrom="paragraph">
+              <wp:posOffset>2346960</wp:posOffset>
+            </wp:positionV>
+            <wp:extent cx="1799590" cy="1799590"/>
+            <wp:effectExtent l="0" t="0" r="0" b="0"/>
+            <wp:wrapNone/>
+            <wp:docPr id="1620741190" name="Picture 5" descr="The image shows a black and white patterned background with a simple, abstract geometric design featuring black and white blocks and lines.&#10;&#10;AI-generated content may be incorrect."/>
+            <wp:cNvGraphicFramePr>
+              <a:graphicFrameLocks xmlns:a="http://schemas.openxmlformats.org/drawingml/2006/main" noChangeAspect="1"/>
+            </wp:cNvGraphicFramePr>
+            <a:graphic xmlns:a="http://schemas.openxmlformats.org/drawingml/2006/main">
+              <a:graphicData uri="http://schemas.openxmlformats.org/drawingml/2006/picture">
+                <pic:pic xmlns:pic="http://schemas.openxmlformats.org/drawingml/2006/picture">
+                  <pic:nvPicPr>
+                    <pic:cNvPr id="1620741190" name="Picture 5" descr="The image shows a black and white patterned background with a simple, abstract geometric design featuring black and white blocks and lines.&#10;&#10;AI-generated content may be incorrect."/>
+                    <pic:cNvPicPr/>
+                  </pic:nvPicPr>
+                  <pic:blipFill>
+                    <a:blip r:embed="rId8">
+                      <a:extLst>
+                        <a:ext uri="{28A0092B-C50C-407E-A947-70E740481C1C}">
+                          <a14:useLocalDpi xmlns:a14="http://schemas.microsoft.com/office/drawing/2010/main" val="0"/>
+                        </a:ext>
+                      </a:extLst>
+                    </a:blip>
+                    <a:stretch>
+                      <a:fillRect/>
+                    </a:stretch>
+                  </pic:blipFill>
+                  <pic:spPr>
+                    <a:xfrm>
+                      <a:off x="0" y="0"/>
+                      <a:ext cx="1799590" cy="1799590"/>
+                    </a:xfrm>
+                    <a:prstGeom prst="rect">
+                      <a:avLst/>
+                    </a:prstGeom>
+                  </pic:spPr>
+                </pic:pic>
+              </a:graphicData>
+            </a:graphic>
+            <wp14:sizeRelH relativeFrom="page">
+              <wp14:pctWidth>0</wp14:pctWidth>
+            </wp14:sizeRelH>
+            <wp14:sizeRelV relativeFrom="page">
+              <wp14:pctHeight>0</wp14:pctHeight>
+            </wp14:sizeRelV>
+          </wp:anchor>
+        </w:drawing>
+      </w:r>
+      <w:r>
+        <w:rPr>
+          <w:noProof/>
+        </w:rPr>
+        <w:drawing>
+          <wp:anchor distT="0" distB="0" distL="114300" distR="114300" simplePos="0" relativeHeight="251659264" behindDoc="0" locked="0" layoutInCell="1" allowOverlap="1" wp14:anchorId="70C24CCD" wp14:editId="25AAFDD0">
+            <wp:simplePos x="0" y="0"/>
+            <wp:positionH relativeFrom="column">
+              <wp:posOffset>-585470</wp:posOffset>
+            </wp:positionH>
+            <wp:positionV relativeFrom="paragraph">
+              <wp:posOffset>2351723</wp:posOffset>
+            </wp:positionV>
+            <wp:extent cx="1799590" cy="1799590"/>
+            <wp:effectExtent l="0" t="0" r="0" b="0"/>
+            <wp:wrapNone/>
+            <wp:docPr id="1782883457" name="Picture 4" descr="The image is a black and white pattern with a simple, pixelated, checkered design.&#10;&#10;AI-generated content may be incorrect."/>
+            <wp:cNvGraphicFramePr>
+              <a:graphicFrameLocks xmlns:a="http://schemas.openxmlformats.org/drawingml/2006/main" noChangeAspect="1"/>
+            </wp:cNvGraphicFramePr>
+            <a:graphic xmlns:a="http://schemas.openxmlformats.org/drawingml/2006/main">
+              <a:graphicData uri="http://schemas.openxmlformats.org/drawingml/2006/picture">
+                <pic:pic xmlns:pic="http://schemas.openxmlformats.org/drawingml/2006/picture">
+                  <pic:nvPicPr>
+                    <pic:cNvPr id="1782883457" name="Picture 4" descr="The image is a black and white pattern with a simple, pixelated, checkered design.&#10;&#10;AI-generated content may be incorrect."/>
+                    <pic:cNvPicPr/>
+                  </pic:nvPicPr>
+                  <pic:blipFill>
+                    <a:blip r:embed="rId9">
+                      <a:extLst>
+                        <a:ext uri="{28A0092B-C50C-407E-A947-70E740481C1C}">
+                          <a14:useLocalDpi xmlns:a14="http://schemas.microsoft.com/office/drawing/2010/main" val="0"/>
+                        </a:ext>
+                      </a:extLst>
+                    </a:blip>
+                    <a:stretch>
+                      <a:fillRect/>
+                    </a:stretch>
+                  </pic:blipFill>
+                  <pic:spPr>
+                    <a:xfrm>
+                      <a:off x="0" y="0"/>
+                      <a:ext cx="1799590" cy="1799590"/>
+                    </a:xfrm>
+                    <a:prstGeom prst="rect">
+                      <a:avLst/>
+                    </a:prstGeom>
+                  </pic:spPr>
+                </pic:pic>
+              </a:graphicData>
+            </a:graphic>
+            <wp14:sizeRelH relativeFrom="page">
+              <wp14:pctWidth>0</wp14:pctWidth>
+            </wp14:sizeRelH>
+            <wp14:sizeRelV relativeFrom="page">
+              <wp14:pctHeight>0</wp14:pctHeight>
+            </wp14:sizeRelV>
+          </wp:anchor>
+        </w:drawing>
+      </w:r>
+      <w:r>
+        <w:rPr>
+          <w:noProof/>
+        </w:rPr>
+        <w:drawing>
+          <wp:anchor distT="0" distB="0" distL="114300" distR="114300" simplePos="0" relativeHeight="251667456" behindDoc="0" locked="0" layoutInCell="1" allowOverlap="1" wp14:anchorId="57767822" wp14:editId="26A7A0EB">
+            <wp:simplePos x="0" y="0"/>
+            <wp:positionH relativeFrom="column">
+              <wp:posOffset>6629083</wp:posOffset>
+            </wp:positionH>
+            <wp:positionV relativeFrom="paragraph">
+              <wp:posOffset>-571500</wp:posOffset>
+            </wp:positionV>
+            <wp:extent cx="1799590" cy="1799590"/>
+            <wp:effectExtent l="0" t="0" r="0" b="0"/>
+            <wp:wrapNone/>
+            <wp:docPr id="554520016" name="Picture 5" descr="The image shows a black and white patterned background with a simple, abstract geometric design featuring black and white blocks and lines.&#10;&#10;AI-generated content may be incorrect."/>
+            <wp:cNvGraphicFramePr>
+              <a:graphicFrameLocks xmlns:a="http://schemas.openxmlformats.org/drawingml/2006/main" noChangeAspect="1"/>
+            </wp:cNvGraphicFramePr>
+            <a:graphic xmlns:a="http://schemas.openxmlformats.org/drawingml/2006/main">
+              <a:graphicData uri="http://schemas.openxmlformats.org/drawingml/2006/picture">
+                <pic:pic xmlns:pic="http://schemas.openxmlformats.org/drawingml/2006/picture">
+                  <pic:nvPicPr>
+                    <pic:cNvPr id="1620741190" name="Picture 5" descr="The image shows a black and white patterned background with a simple, abstract geometric design featuring black and white blocks and lines.&#10;&#10;AI-generated content may be incorrect."/>
+                    <pic:cNvPicPr/>
+                  </pic:nvPicPr>
+                  <pic:blipFill>
+                    <a:blip r:embed="rId8">
+                      <a:extLst>
+                        <a:ext uri="{28A0092B-C50C-407E-A947-70E740481C1C}">
+                          <a14:useLocalDpi xmlns:a14="http://schemas.microsoft.com/office/drawing/2010/main" val="0"/>
+                        </a:ext>
+                      </a:extLst>
+                    </a:blip>
+                    <a:stretch>
+                      <a:fillRect/>
+                    </a:stretch>
+                  </pic:blipFill>
+                  <pic:spPr>
+                    <a:xfrm>
+                      <a:off x="0" y="0"/>
+                      <a:ext cx="1799590" cy="1799590"/>
+                    </a:xfrm>
+                    <a:prstGeom prst="rect">
+                      <a:avLst/>
+                    </a:prstGeom>
+                  </pic:spPr>
+                </pic:pic>
+              </a:graphicData>
+            </a:graphic>
+            <wp14:sizeRelH relativeFrom="page">
+              <wp14:pctWidth>0</wp14:pctWidth>
+            </wp14:sizeRelH>
+            <wp14:sizeRelV relativeFrom="page">
+              <wp14:pctHeight>0</wp14:pctHeight>
+            </wp14:sizeRelV>
+          </wp:anchor>
+        </w:drawing>
+      </w:r>
+      <w:r>
+        <w:rPr>
+          <w:noProof/>
+        </w:rPr>
+        <w:drawing>
+          <wp:anchor distT="0" distB="0" distL="114300" distR="114300" simplePos="0" relativeHeight="251660288" behindDoc="0" locked="0" layoutInCell="1" allowOverlap="1" wp14:anchorId="27B18FF7" wp14:editId="38F09961">
+            <wp:simplePos x="0" y="0"/>
+            <wp:positionH relativeFrom="column">
+              <wp:posOffset>4161472</wp:posOffset>
+            </wp:positionH>
+            <wp:positionV relativeFrom="paragraph">
+              <wp:posOffset>-547687</wp:posOffset>
+            </wp:positionV>
+            <wp:extent cx="1799590" cy="1799590"/>
+            <wp:effectExtent l="0" t="0" r="0" b="0"/>
+            <wp:wrapNone/>
+            <wp:docPr id="1347578689" name="Picture 3" descr="i&#10;&#10;AI-generated content may be incorrect."/>
+            <wp:cNvGraphicFramePr>
+              <a:graphicFrameLocks xmlns:a="http://schemas.openxmlformats.org/drawingml/2006/main" noChangeAspect="1"/>
+            </wp:cNvGraphicFramePr>
+            <a:graphic xmlns:a="http://schemas.openxmlformats.org/drawingml/2006/main">
+              <a:graphicData uri="http://schemas.openxmlformats.org/drawingml/2006/picture">
+                <pic:pic xmlns:pic="http://schemas.openxmlformats.org/drawingml/2006/picture">
+                  <pic:nvPicPr>
+                    <pic:cNvPr id="1347578689" name="Picture 3" descr="i&#10;&#10;AI-generated content may be incorrect."/>
+                    <pic:cNvPicPr/>
+                  </pic:nvPicPr>
+                  <pic:blipFill>
+                    <a:blip r:embed="rId10">
+                      <a:extLst>
+                        <a:ext uri="{28A0092B-C50C-407E-A947-70E740481C1C}">
+                          <a14:useLocalDpi xmlns:a14="http://schemas.microsoft.com/office/drawing/2010/main" val="0"/>
+                        </a:ext>
+                      </a:extLst>
+                    </a:blip>
+                    <a:stretch>
+                      <a:fillRect/>
+                    </a:stretch>
+                  </pic:blipFill>
+                  <pic:spPr>
+                    <a:xfrm>
+                      <a:off x="0" y="0"/>
+                      <a:ext cx="1799590" cy="1799590"/>
+                    </a:xfrm>
+                    <a:prstGeom prst="rect">
+                      <a:avLst/>
+                    </a:prstGeom>
+                  </pic:spPr>
+                </pic:pic>
+              </a:graphicData>
+            </a:graphic>
+            <wp14:sizeRelH relativeFrom="page">
+              <wp14:pctWidth>0</wp14:pctWidth>
+            </wp14:sizeRelH>
+            <wp14:sizeRelV relativeFrom="page">
+              <wp14:pctHeight>0</wp14:pctHeight>
+            </wp14:sizeRelV>
+          </wp:anchor>
+        </w:drawing>
+      </w:r>
+      <w:r>
+        <w:rPr>
+          <w:noProof/>
+        </w:rPr>
+        <w:drawing>
+          <wp:anchor distT="0" distB="0" distL="114300" distR="114300" simplePos="0" relativeHeight="251661312" behindDoc="0" locked="0" layoutInCell="1" allowOverlap="1" wp14:anchorId="1DB10A86" wp14:editId="77573CAD">
+            <wp:simplePos x="0" y="0"/>
+            <wp:positionH relativeFrom="column">
+              <wp:posOffset>1747520</wp:posOffset>
+            </wp:positionH>
+            <wp:positionV relativeFrom="paragraph">
+              <wp:posOffset>-548005</wp:posOffset>
+            </wp:positionV>
+            <wp:extent cx="1799590" cy="1799590"/>
+            <wp:effectExtent l="0" t="0" r="0" b="0"/>
+            <wp:wrapNone/>
+            <wp:docPr id="488119219" name="Picture 2" descr="The image appears to be a black and white pattern with a series of geometric shapes or pixels that may suggest a digital or abstract design.&#10;&#10;AI-generated content may be incorrect."/>
+            <wp:cNvGraphicFramePr>
+              <a:graphicFrameLocks xmlns:a="http://schemas.openxmlformats.org/drawingml/2006/main" noChangeAspect="1"/>
+            </wp:cNvGraphicFramePr>
+            <a:graphic xmlns:a="http://schemas.openxmlformats.org/drawingml/2006/main">
+              <a:graphicData uri="http://schemas.openxmlformats.org/drawingml/2006/picture">
+                <pic:pic xmlns:pic="http://schemas.openxmlformats.org/drawingml/2006/picture">
+                  <pic:nvPicPr>
+                    <pic:cNvPr id="488119219" name="Picture 2" descr="The image appears to be a black and white pattern with a series of geometric shapes or pixels that may suggest a digital or abstract design.&#10;&#10;AI-generated content may be incorrect."/>
+                    <pic:cNvPicPr/>
+                  </pic:nvPicPr>
+                  <pic:blipFill>
+                    <a:blip r:embed="rId11">
+                      <a:extLst>
+                        <a:ext uri="{28A0092B-C50C-407E-A947-70E740481C1C}">
+                          <a14:useLocalDpi xmlns:a14="http://schemas.microsoft.com/office/drawing/2010/main" val="0"/>
+                        </a:ext>
+                      </a:extLst>
+                    </a:blip>
+                    <a:stretch>
+                      <a:fillRect/>
+                    </a:stretch>
+                  </pic:blipFill>
+                  <pic:spPr>
+                    <a:xfrm>
+                      <a:off x="0" y="0"/>
+                      <a:ext cx="1799590" cy="1799590"/>
+                    </a:xfrm>
+                    <a:prstGeom prst="rect">
+                      <a:avLst/>
+                    </a:prstGeom>
+                  </pic:spPr>
+                </pic:pic>
+              </a:graphicData>
+            </a:graphic>
+            <wp14:sizeRelH relativeFrom="page">
+              <wp14:pctWidth>0</wp14:pctWidth>
+            </wp14:sizeRelH>
+            <wp14:sizeRelV relativeFrom="page">
+              <wp14:pctHeight>0</wp14:pctHeight>
+            </wp14:sizeRelV>
+          </wp:anchor>
+        </w:drawing>
+      </w:r>
+      <w:r>
+        <w:rPr>
+          <w:noProof/>
+        </w:rPr>
+        <w:drawing>
+          <wp:anchor distT="0" distB="0" distL="114300" distR="114300" simplePos="0" relativeHeight="251662336" behindDoc="1" locked="0" layoutInCell="1" allowOverlap="1" wp14:anchorId="0F6F0981" wp14:editId="4C0C00D5">
+            <wp:simplePos x="0" y="0"/>
+            <wp:positionH relativeFrom="column">
+              <wp:posOffset>-571500</wp:posOffset>
+            </wp:positionH>
+            <wp:positionV relativeFrom="paragraph">
+              <wp:posOffset>-571500</wp:posOffset>
+            </wp:positionV>
+            <wp:extent cx="1799590" cy="1799590"/>
+            <wp:effectExtent l="0" t="0" r="0" b="0"/>
+            <wp:wrapNone/>
+            <wp:docPr id="1710969230" name="Picture 1" descr="The image depicts a stark, minimalistic design with black and white geometric shapes arranged in a fragmented, abstract pattern.&#10;&#10;AI-generated content may be incorrect."/>
+            <wp:cNvGraphicFramePr>
+              <a:graphicFrameLocks xmlns:a="http://schemas.openxmlformats.org/drawingml/2006/main" noChangeAspect="1"/>
+            </wp:cNvGraphicFramePr>
+            <a:graphic xmlns:a="http://schemas.openxmlformats.org/drawingml/2006/main">
+              <a:graphicData uri="http://schemas.openxmlformats.org/drawingml/2006/picture">
+                <pic:pic xmlns:pic="http://schemas.openxmlformats.org/drawingml/2006/picture">
+                  <pic:nvPicPr>
+                    <pic:cNvPr id="1710969230" name="Picture 1" descr="The image depicts a stark, minimalistic design with black and white geometric shapes arranged in a fragmented, abstract pattern.&#10;&#10;AI-generated content may be incorrect."/>
+                    <pic:cNvPicPr/>
+                  </pic:nvPicPr>
+                  <pic:blipFill>
+                    <a:blip r:embed="rId12">
+                      <a:extLst>
+                        <a:ext uri="{28A0092B-C50C-407E-A947-70E740481C1C}">
+                          <a14:useLocalDpi xmlns:a14="http://schemas.microsoft.com/office/drawing/2010/main" val="0"/>
+                        </a:ext>
+                      </a:extLst>
+                    </a:blip>
+                    <a:stretch>
+                      <a:fillRect/>
+                    </a:stretch>
+                  </pic:blipFill>
+                  <pic:spPr>
+                    <a:xfrm>
+                      <a:off x="0" y="0"/>
+                      <a:ext cx="1799590" cy="1799590"/>
+                    </a:xfrm>
+                    <a:prstGeom prst="rect">
+                      <a:avLst/>
+                    </a:prstGeom>
+                  </pic:spPr>
+                </pic:pic>
+              </a:graphicData>
+            </a:graphic>
+            <wp14:sizeRelH relativeFrom="page">
+              <wp14:pctWidth>0</wp14:pctWidth>
+            </wp14:sizeRelH>
+            <wp14:sizeRelV relativeFrom="page">
+              <wp14:pctHeight>0</wp14:pctHeight>
+            </wp14:sizeRelV>
+          </wp:anchor>
+        </w:drawing>
+      </w:r>
       <w:r>
         <w:rPr>
           <w:noProof/>
@@ -31,7 +553,7 @@
                     <pic:cNvPicPr/>
                   </pic:nvPicPr>
                   <pic:blipFill>
-                    <a:blip r:embed="rId4"/>
+                    <a:blip r:embed="rId7"/>
                     <a:stretch>
                       <a:fillRect/>
                     </a:stretch>
@@ -85,288 +607,6 @@
                     <pic:cNvPicPr/>
                   </pic:nvPicPr>
                   <pic:blipFill>
-                    <a:blip r:embed="rId4"/>
-                    <a:stretch>
-                      <a:fillRect/>
-                    </a:stretch>
-                  </pic:blipFill>
-                  <pic:spPr>
-                    <a:xfrm>
-                      <a:off x="0" y="0"/>
-                      <a:ext cx="1800000" cy="1800000"/>
-                    </a:xfrm>
-                    <a:prstGeom prst="rect">
-                      <a:avLst/>
-                    </a:prstGeom>
-                  </pic:spPr>
-                </pic:pic>
-              </a:graphicData>
-            </a:graphic>
-            <wp14:sizeRelH relativeFrom="page">
-              <wp14:pctWidth>0</wp14:pctWidth>
-            </wp14:sizeRelH>
-            <wp14:sizeRelV relativeFrom="page">
-              <wp14:pctHeight>0</wp14:pctHeight>
-            </wp14:sizeRelV>
-          </wp:anchor>
-        </w:drawing>
-      </w:r>
-      <w:r>
-        <w:rPr>
-          <w:noProof/>
-        </w:rPr>
-        <w:drawing>
-          <wp:anchor distT="0" distB="0" distL="114300" distR="114300" simplePos="0" relativeHeight="251669504" behindDoc="0" locked="0" layoutInCell="1" allowOverlap="1" wp14:anchorId="6960DD57" wp14:editId="7148CD35">
-            <wp:simplePos x="0" y="0"/>
-            <wp:positionH relativeFrom="column">
-              <wp:posOffset>-305117</wp:posOffset>
-            </wp:positionH>
-            <wp:positionV relativeFrom="paragraph">
-              <wp:posOffset>7548245</wp:posOffset>
-            </wp:positionV>
-            <wp:extent cx="1799590" cy="1799590"/>
-            <wp:effectExtent l="0" t="0" r="0" b="0"/>
-            <wp:wrapNone/>
-            <wp:docPr id="28244017" name="Picture 5" descr="The image shows a black and white patterned background with a simple, abstract geometric design featuring black and white blocks and lines.&#10;&#10;AI-generated content may be incorrect."/>
-            <wp:cNvGraphicFramePr>
-              <a:graphicFrameLocks xmlns:a="http://schemas.openxmlformats.org/drawingml/2006/main" noChangeAspect="1"/>
-            </wp:cNvGraphicFramePr>
-            <a:graphic xmlns:a="http://schemas.openxmlformats.org/drawingml/2006/main">
-              <a:graphicData uri="http://schemas.openxmlformats.org/drawingml/2006/picture">
-                <pic:pic xmlns:pic="http://schemas.openxmlformats.org/drawingml/2006/picture">
-                  <pic:nvPicPr>
-                    <pic:cNvPr id="1620741190" name="Picture 5" descr="The image shows a black and white patterned background with a simple, abstract geometric design featuring black and white blocks and lines.&#10;&#10;AI-generated content may be incorrect."/>
-                    <pic:cNvPicPr/>
-                  </pic:nvPicPr>
-                  <pic:blipFill>
-                    <a:blip r:embed="rId5">
-                      <a:extLst>
-                        <a:ext uri="{28A0092B-C50C-407E-A947-70E740481C1C}">
-                          <a14:useLocalDpi xmlns:a14="http://schemas.microsoft.com/office/drawing/2010/main" val="0"/>
-                        </a:ext>
-                      </a:extLst>
-                    </a:blip>
-                    <a:stretch>
-                      <a:fillRect/>
-                    </a:stretch>
-                  </pic:blipFill>
-                  <pic:spPr>
-                    <a:xfrm>
-                      <a:off x="0" y="0"/>
-                      <a:ext cx="1799590" cy="1799590"/>
-                    </a:xfrm>
-                    <a:prstGeom prst="rect">
-                      <a:avLst/>
-                    </a:prstGeom>
-                  </pic:spPr>
-                </pic:pic>
-              </a:graphicData>
-            </a:graphic>
-            <wp14:sizeRelH relativeFrom="page">
-              <wp14:pctWidth>0</wp14:pctWidth>
-            </wp14:sizeRelH>
-            <wp14:sizeRelV relativeFrom="page">
-              <wp14:pctHeight>0</wp14:pctHeight>
-            </wp14:sizeRelV>
-          </wp:anchor>
-        </w:drawing>
-      </w:r>
-      <w:r>
-        <w:rPr>
-          <w:noProof/>
-        </w:rPr>
-        <w:drawing>
-          <wp:anchor distT="0" distB="0" distL="114300" distR="114300" simplePos="0" relativeHeight="251667456" behindDoc="0" locked="0" layoutInCell="1" allowOverlap="1" wp14:anchorId="57767822" wp14:editId="0F950A53">
-            <wp:simplePos x="0" y="0"/>
-            <wp:positionH relativeFrom="column">
-              <wp:posOffset>4510087</wp:posOffset>
-            </wp:positionH>
-            <wp:positionV relativeFrom="paragraph">
-              <wp:posOffset>5138420</wp:posOffset>
-            </wp:positionV>
-            <wp:extent cx="1799590" cy="1799590"/>
-            <wp:effectExtent l="0" t="0" r="0" b="0"/>
-            <wp:wrapNone/>
-            <wp:docPr id="554520016" name="Picture 5" descr="The image shows a black and white patterned background with a simple, abstract geometric design featuring black and white blocks and lines.&#10;&#10;AI-generated content may be incorrect."/>
-            <wp:cNvGraphicFramePr>
-              <a:graphicFrameLocks xmlns:a="http://schemas.openxmlformats.org/drawingml/2006/main" noChangeAspect="1"/>
-            </wp:cNvGraphicFramePr>
-            <a:graphic xmlns:a="http://schemas.openxmlformats.org/drawingml/2006/main">
-              <a:graphicData uri="http://schemas.openxmlformats.org/drawingml/2006/picture">
-                <pic:pic xmlns:pic="http://schemas.openxmlformats.org/drawingml/2006/picture">
-                  <pic:nvPicPr>
-                    <pic:cNvPr id="1620741190" name="Picture 5" descr="The image shows a black and white patterned background with a simple, abstract geometric design featuring black and white blocks and lines.&#10;&#10;AI-generated content may be incorrect."/>
-                    <pic:cNvPicPr/>
-                  </pic:nvPicPr>
-                  <pic:blipFill>
-                    <a:blip r:embed="rId5">
-                      <a:extLst>
-                        <a:ext uri="{28A0092B-C50C-407E-A947-70E740481C1C}">
-                          <a14:useLocalDpi xmlns:a14="http://schemas.microsoft.com/office/drawing/2010/main" val="0"/>
-                        </a:ext>
-                      </a:extLst>
-                    </a:blip>
-                    <a:stretch>
-                      <a:fillRect/>
-                    </a:stretch>
-                  </pic:blipFill>
-                  <pic:spPr>
-                    <a:xfrm>
-                      <a:off x="0" y="0"/>
-                      <a:ext cx="1799590" cy="1799590"/>
-                    </a:xfrm>
-                    <a:prstGeom prst="rect">
-                      <a:avLst/>
-                    </a:prstGeom>
-                  </pic:spPr>
-                </pic:pic>
-              </a:graphicData>
-            </a:graphic>
-            <wp14:sizeRelH relativeFrom="page">
-              <wp14:pctWidth>0</wp14:pctWidth>
-            </wp14:sizeRelH>
-            <wp14:sizeRelV relativeFrom="page">
-              <wp14:pctHeight>0</wp14:pctHeight>
-            </wp14:sizeRelV>
-          </wp:anchor>
-        </w:drawing>
-      </w:r>
-      <w:r>
-        <w:rPr>
-          <w:noProof/>
-        </w:rPr>
-        <w:drawing>
-          <wp:anchor distT="0" distB="0" distL="114300" distR="114300" simplePos="0" relativeHeight="251663360" behindDoc="0" locked="0" layoutInCell="1" allowOverlap="1" wp14:anchorId="618C7B7B" wp14:editId="0AF10FBE">
-            <wp:simplePos x="0" y="0"/>
-            <wp:positionH relativeFrom="column">
-              <wp:posOffset>4590732</wp:posOffset>
-            </wp:positionH>
-            <wp:positionV relativeFrom="paragraph">
-              <wp:posOffset>2323782</wp:posOffset>
-            </wp:positionV>
-            <wp:extent cx="1800000" cy="1800000"/>
-            <wp:effectExtent l="0" t="0" r="0" b="0"/>
-            <wp:wrapNone/>
-            <wp:docPr id="1936521166" name="Picture 1" descr="F&#10;&#10;AI-generated content may be incorrect."/>
-            <wp:cNvGraphicFramePr>
-              <a:graphicFrameLocks xmlns:a="http://schemas.openxmlformats.org/drawingml/2006/main" noChangeAspect="1"/>
-            </wp:cNvGraphicFramePr>
-            <a:graphic xmlns:a="http://schemas.openxmlformats.org/drawingml/2006/main">
-              <a:graphicData uri="http://schemas.openxmlformats.org/drawingml/2006/picture">
-                <pic:pic xmlns:pic="http://schemas.openxmlformats.org/drawingml/2006/picture">
-                  <pic:nvPicPr>
-                    <pic:cNvPr id="1936521166" name="Picture 1" descr="F&#10;&#10;AI-generated content may be incorrect."/>
-                    <pic:cNvPicPr/>
-                  </pic:nvPicPr>
-                  <pic:blipFill>
-                    <a:blip r:embed="rId4"/>
-                    <a:stretch>
-                      <a:fillRect/>
-                    </a:stretch>
-                  </pic:blipFill>
-                  <pic:spPr>
-                    <a:xfrm>
-                      <a:off x="0" y="0"/>
-                      <a:ext cx="1800000" cy="1800000"/>
-                    </a:xfrm>
-                    <a:prstGeom prst="rect">
-                      <a:avLst/>
-                    </a:prstGeom>
-                  </pic:spPr>
-                </pic:pic>
-              </a:graphicData>
-            </a:graphic>
-            <wp14:sizeRelH relativeFrom="page">
-              <wp14:pctWidth>0</wp14:pctWidth>
-            </wp14:sizeRelH>
-            <wp14:sizeRelV relativeFrom="page">
-              <wp14:pctHeight>0</wp14:pctHeight>
-            </wp14:sizeRelV>
-          </wp:anchor>
-        </w:drawing>
-      </w:r>
-      <w:r>
-        <w:rPr>
-          <w:noProof/>
-        </w:rPr>
-        <w:drawing>
-          <wp:anchor distT="0" distB="0" distL="114300" distR="114300" simplePos="0" relativeHeight="251665408" behindDoc="0" locked="0" layoutInCell="1" allowOverlap="1" wp14:anchorId="004C9B95" wp14:editId="0466B2D6">
-            <wp:simplePos x="0" y="0"/>
-            <wp:positionH relativeFrom="column">
-              <wp:posOffset>2119313</wp:posOffset>
-            </wp:positionH>
-            <wp:positionV relativeFrom="paragraph">
-              <wp:posOffset>5124133</wp:posOffset>
-            </wp:positionV>
-            <wp:extent cx="1800000" cy="1800000"/>
-            <wp:effectExtent l="0" t="0" r="0" b="0"/>
-            <wp:wrapNone/>
-            <wp:docPr id="303302034" name="Picture 3" descr="The image depicts a simple, abstract geometric pattern with intersecting lines and white shapes.&#10;&#10;AI-generated content may be incorrect."/>
-            <wp:cNvGraphicFramePr>
-              <a:graphicFrameLocks xmlns:a="http://schemas.openxmlformats.org/drawingml/2006/main" noChangeAspect="1"/>
-            </wp:cNvGraphicFramePr>
-            <a:graphic xmlns:a="http://schemas.openxmlformats.org/drawingml/2006/main">
-              <a:graphicData uri="http://schemas.openxmlformats.org/drawingml/2006/picture">
-                <pic:pic xmlns:pic="http://schemas.openxmlformats.org/drawingml/2006/picture">
-                  <pic:nvPicPr>
-                    <pic:cNvPr id="303302034" name="Picture 3" descr="The image depicts a simple, abstract geometric pattern with intersecting lines and white shapes.&#10;&#10;AI-generated content may be incorrect."/>
-                    <pic:cNvPicPr/>
-                  </pic:nvPicPr>
-                  <pic:blipFill>
-                    <a:blip r:embed="rId6"/>
-                    <a:stretch>
-                      <a:fillRect/>
-                    </a:stretch>
-                  </pic:blipFill>
-                  <pic:spPr>
-                    <a:xfrm>
-                      <a:off x="0" y="0"/>
-                      <a:ext cx="1800000" cy="1800000"/>
-                    </a:xfrm>
-                    <a:prstGeom prst="rect">
-                      <a:avLst/>
-                    </a:prstGeom>
-                  </pic:spPr>
-                </pic:pic>
-              </a:graphicData>
-            </a:graphic>
-            <wp14:sizeRelH relativeFrom="page">
-              <wp14:pctWidth>0</wp14:pctWidth>
-            </wp14:sizeRelH>
-            <wp14:sizeRelV relativeFrom="page">
-              <wp14:pctHeight>0</wp14:pctHeight>
-            </wp14:sizeRelV>
-          </wp:anchor>
-        </w:drawing>
-      </w:r>
-      <w:r>
-        <w:rPr>
-          <w:noProof/>
-        </w:rPr>
-        <w:drawing>
-          <wp:anchor distT="0" distB="0" distL="114300" distR="114300" simplePos="0" relativeHeight="251664384" behindDoc="0" locked="0" layoutInCell="1" allowOverlap="1" wp14:anchorId="08BC9B04" wp14:editId="0C89B4CC">
-            <wp:simplePos x="0" y="0"/>
-            <wp:positionH relativeFrom="column">
-              <wp:posOffset>-352425</wp:posOffset>
-            </wp:positionH>
-            <wp:positionV relativeFrom="paragraph">
-              <wp:posOffset>5181600</wp:posOffset>
-            </wp:positionV>
-            <wp:extent cx="1800000" cy="1800000"/>
-            <wp:effectExtent l="0" t="0" r="0" b="0"/>
-            <wp:wrapNone/>
-            <wp:docPr id="630145519" name="Picture 2"/>
-            <wp:cNvGraphicFramePr>
-              <a:graphicFrameLocks xmlns:a="http://schemas.openxmlformats.org/drawingml/2006/main" noChangeAspect="1"/>
-            </wp:cNvGraphicFramePr>
-            <a:graphic xmlns:a="http://schemas.openxmlformats.org/drawingml/2006/main">
-              <a:graphicData uri="http://schemas.openxmlformats.org/drawingml/2006/picture">
-                <pic:pic xmlns:pic="http://schemas.openxmlformats.org/drawingml/2006/picture">
-                  <pic:nvPicPr>
-                    <pic:cNvPr id="630145519" name="Picture 2"/>
-                    <pic:cNvPicPr/>
-                  </pic:nvPicPr>
-                  <pic:blipFill>
                     <a:blip r:embed="rId7"/>
                     <a:stretch>
                       <a:fillRect/>
@@ -398,18 +638,18 @@
           <w:noProof/>
         </w:rPr>
         <w:drawing>
-          <wp:anchor distT="0" distB="0" distL="114300" distR="114300" simplePos="0" relativeHeight="251658240" behindDoc="0" locked="0" layoutInCell="1" allowOverlap="1" wp14:anchorId="45D0C538" wp14:editId="6F975DA9">
+          <wp:anchor distT="0" distB="0" distL="114300" distR="114300" simplePos="0" relativeHeight="251669504" behindDoc="0" locked="0" layoutInCell="1" allowOverlap="1" wp14:anchorId="6960DD57" wp14:editId="121323A1">
             <wp:simplePos x="0" y="0"/>
             <wp:positionH relativeFrom="column">
-              <wp:posOffset>2047240</wp:posOffset>
+              <wp:posOffset>-305117</wp:posOffset>
             </wp:positionH>
             <wp:positionV relativeFrom="paragraph">
-              <wp:posOffset>2366327</wp:posOffset>
+              <wp:posOffset>7548245</wp:posOffset>
             </wp:positionV>
             <wp:extent cx="1799590" cy="1799590"/>
             <wp:effectExtent l="0" t="0" r="0" b="0"/>
             <wp:wrapNone/>
-            <wp:docPr id="1620741190" name="Picture 5" descr="The image shows a black and white patterned background with a simple, abstract geometric design featuring black and white blocks and lines.&#10;&#10;AI-generated content may be incorrect."/>
+            <wp:docPr id="28244017" name="Picture 5" descr="The image shows a black and white patterned background with a simple, abstract geometric design featuring black and white blocks and lines.&#10;&#10;AI-generated content may be incorrect."/>
             <wp:cNvGraphicFramePr>
               <a:graphicFrameLocks xmlns:a="http://schemas.openxmlformats.org/drawingml/2006/main" noChangeAspect="1"/>
             </wp:cNvGraphicFramePr>
@@ -418,66 +658,6 @@
                 <pic:pic xmlns:pic="http://schemas.openxmlformats.org/drawingml/2006/picture">
                   <pic:nvPicPr>
                     <pic:cNvPr id="1620741190" name="Picture 5" descr="The image shows a black and white patterned background with a simple, abstract geometric design featuring black and white blocks and lines.&#10;&#10;AI-generated content may be incorrect."/>
-                    <pic:cNvPicPr/>
-                  </pic:nvPicPr>
-                  <pic:blipFill>
-                    <a:blip r:embed="rId5">
-                      <a:extLst>
-                        <a:ext uri="{28A0092B-C50C-407E-A947-70E740481C1C}">
-                          <a14:useLocalDpi xmlns:a14="http://schemas.microsoft.com/office/drawing/2010/main" val="0"/>
-                        </a:ext>
-                      </a:extLst>
-                    </a:blip>
-                    <a:stretch>
-                      <a:fillRect/>
-                    </a:stretch>
-                  </pic:blipFill>
-                  <pic:spPr>
-                    <a:xfrm>
-                      <a:off x="0" y="0"/>
-                      <a:ext cx="1799590" cy="1799590"/>
-                    </a:xfrm>
-                    <a:prstGeom prst="rect">
-                      <a:avLst/>
-                    </a:prstGeom>
-                  </pic:spPr>
-                </pic:pic>
-              </a:graphicData>
-            </a:graphic>
-            <wp14:sizeRelH relativeFrom="page">
-              <wp14:pctWidth>0</wp14:pctWidth>
-            </wp14:sizeRelH>
-            <wp14:sizeRelV relativeFrom="page">
-              <wp14:pctHeight>0</wp14:pctHeight>
-            </wp14:sizeRelV>
-          </wp:anchor>
-        </w:drawing>
-      </w:r>
-      <w:r>
-        <w:rPr>
-          <w:noProof/>
-        </w:rPr>
-        <w:drawing>
-          <wp:anchor distT="0" distB="0" distL="114300" distR="114300" simplePos="0" relativeHeight="251659264" behindDoc="0" locked="0" layoutInCell="1" allowOverlap="1" wp14:anchorId="70C24CCD" wp14:editId="03E58F84">
-            <wp:simplePos x="0" y="0"/>
-            <wp:positionH relativeFrom="column">
-              <wp:posOffset>-385762</wp:posOffset>
-            </wp:positionH>
-            <wp:positionV relativeFrom="paragraph">
-              <wp:posOffset>2442210</wp:posOffset>
-            </wp:positionV>
-            <wp:extent cx="1799590" cy="1799590"/>
-            <wp:effectExtent l="0" t="0" r="0" b="0"/>
-            <wp:wrapNone/>
-            <wp:docPr id="1782883457" name="Picture 4" descr="The image is a black and white pattern with a simple, pixelated, checkered design.&#10;&#10;AI-generated content may be incorrect."/>
-            <wp:cNvGraphicFramePr>
-              <a:graphicFrameLocks xmlns:a="http://schemas.openxmlformats.org/drawingml/2006/main" noChangeAspect="1"/>
-            </wp:cNvGraphicFramePr>
-            <a:graphic xmlns:a="http://schemas.openxmlformats.org/drawingml/2006/main">
-              <a:graphicData uri="http://schemas.openxmlformats.org/drawingml/2006/picture">
-                <pic:pic xmlns:pic="http://schemas.openxmlformats.org/drawingml/2006/picture">
-                  <pic:nvPicPr>
-                    <pic:cNvPr id="1782883457" name="Picture 4" descr="The image is a black and white pattern with a simple, pixelated, checkered design.&#10;&#10;AI-generated content may be incorrect."/>
                     <pic:cNvPicPr/>
                   </pic:nvPicPr>
                   <pic:blipFill>
@@ -513,189 +693,9 @@
           </wp:anchor>
         </w:drawing>
       </w:r>
-      <w:r>
-        <w:rPr>
-          <w:noProof/>
-        </w:rPr>
-        <w:drawing>
-          <wp:anchor distT="0" distB="0" distL="114300" distR="114300" simplePos="0" relativeHeight="251660288" behindDoc="0" locked="0" layoutInCell="1" allowOverlap="1" wp14:anchorId="27B18FF7" wp14:editId="4BC73459">
-            <wp:simplePos x="0" y="0"/>
-            <wp:positionH relativeFrom="column">
-              <wp:posOffset>4385310</wp:posOffset>
-            </wp:positionH>
-            <wp:positionV relativeFrom="paragraph">
-              <wp:posOffset>-609917</wp:posOffset>
-            </wp:positionV>
-            <wp:extent cx="1799590" cy="1799590"/>
-            <wp:effectExtent l="0" t="0" r="0" b="0"/>
-            <wp:wrapNone/>
-            <wp:docPr id="1347578689" name="Picture 3" descr="i&#10;&#10;AI-generated content may be incorrect."/>
-            <wp:cNvGraphicFramePr>
-              <a:graphicFrameLocks xmlns:a="http://schemas.openxmlformats.org/drawingml/2006/main" noChangeAspect="1"/>
-            </wp:cNvGraphicFramePr>
-            <a:graphic xmlns:a="http://schemas.openxmlformats.org/drawingml/2006/main">
-              <a:graphicData uri="http://schemas.openxmlformats.org/drawingml/2006/picture">
-                <pic:pic xmlns:pic="http://schemas.openxmlformats.org/drawingml/2006/picture">
-                  <pic:nvPicPr>
-                    <pic:cNvPr id="1347578689" name="Picture 3" descr="i&#10;&#10;AI-generated content may be incorrect."/>
-                    <pic:cNvPicPr/>
-                  </pic:nvPicPr>
-                  <pic:blipFill>
-                    <a:blip r:embed="rId9">
-                      <a:extLst>
-                        <a:ext uri="{28A0092B-C50C-407E-A947-70E740481C1C}">
-                          <a14:useLocalDpi xmlns:a14="http://schemas.microsoft.com/office/drawing/2010/main" val="0"/>
-                        </a:ext>
-                      </a:extLst>
-                    </a:blip>
-                    <a:stretch>
-                      <a:fillRect/>
-                    </a:stretch>
-                  </pic:blipFill>
-                  <pic:spPr>
-                    <a:xfrm>
-                      <a:off x="0" y="0"/>
-                      <a:ext cx="1799590" cy="1799590"/>
-                    </a:xfrm>
-                    <a:prstGeom prst="rect">
-                      <a:avLst/>
-                    </a:prstGeom>
-                  </pic:spPr>
-                </pic:pic>
-              </a:graphicData>
-            </a:graphic>
-            <wp14:sizeRelH relativeFrom="page">
-              <wp14:pctWidth>0</wp14:pctWidth>
-            </wp14:sizeRelH>
-            <wp14:sizeRelV relativeFrom="page">
-              <wp14:pctHeight>0</wp14:pctHeight>
-            </wp14:sizeRelV>
-          </wp:anchor>
-        </w:drawing>
-      </w:r>
-      <w:r>
-        <w:rPr>
-          <w:noProof/>
-        </w:rPr>
-        <w:drawing>
-          <wp:anchor distT="0" distB="0" distL="114300" distR="114300" simplePos="0" relativeHeight="251661312" behindDoc="0" locked="0" layoutInCell="1" allowOverlap="1" wp14:anchorId="1DB10A86" wp14:editId="3D86D54E">
-            <wp:simplePos x="0" y="0"/>
-            <wp:positionH relativeFrom="column">
-              <wp:posOffset>1995170</wp:posOffset>
-            </wp:positionH>
-            <wp:positionV relativeFrom="paragraph">
-              <wp:posOffset>-548322</wp:posOffset>
-            </wp:positionV>
-            <wp:extent cx="1799590" cy="1799590"/>
-            <wp:effectExtent l="0" t="0" r="0" b="0"/>
-            <wp:wrapNone/>
-            <wp:docPr id="488119219" name="Picture 2" descr="The image appears to be a black and white pattern with a series of geometric shapes or pixels that may suggest a digital or abstract design.&#10;&#10;AI-generated content may be incorrect."/>
-            <wp:cNvGraphicFramePr>
-              <a:graphicFrameLocks xmlns:a="http://schemas.openxmlformats.org/drawingml/2006/main" noChangeAspect="1"/>
-            </wp:cNvGraphicFramePr>
-            <a:graphic xmlns:a="http://schemas.openxmlformats.org/drawingml/2006/main">
-              <a:graphicData uri="http://schemas.openxmlformats.org/drawingml/2006/picture">
-                <pic:pic xmlns:pic="http://schemas.openxmlformats.org/drawingml/2006/picture">
-                  <pic:nvPicPr>
-                    <pic:cNvPr id="488119219" name="Picture 2" descr="The image appears to be a black and white pattern with a series of geometric shapes or pixels that may suggest a digital or abstract design.&#10;&#10;AI-generated content may be incorrect."/>
-                    <pic:cNvPicPr/>
-                  </pic:nvPicPr>
-                  <pic:blipFill>
-                    <a:blip r:embed="rId10">
-                      <a:extLst>
-                        <a:ext uri="{28A0092B-C50C-407E-A947-70E740481C1C}">
-                          <a14:useLocalDpi xmlns:a14="http://schemas.microsoft.com/office/drawing/2010/main" val="0"/>
-                        </a:ext>
-                      </a:extLst>
-                    </a:blip>
-                    <a:stretch>
-                      <a:fillRect/>
-                    </a:stretch>
-                  </pic:blipFill>
-                  <pic:spPr>
-                    <a:xfrm>
-                      <a:off x="0" y="0"/>
-                      <a:ext cx="1799590" cy="1799590"/>
-                    </a:xfrm>
-                    <a:prstGeom prst="rect">
-                      <a:avLst/>
-                    </a:prstGeom>
-                  </pic:spPr>
-                </pic:pic>
-              </a:graphicData>
-            </a:graphic>
-            <wp14:sizeRelH relativeFrom="page">
-              <wp14:pctWidth>0</wp14:pctWidth>
-            </wp14:sizeRelH>
-            <wp14:sizeRelV relativeFrom="page">
-              <wp14:pctHeight>0</wp14:pctHeight>
-            </wp14:sizeRelV>
-          </wp:anchor>
-        </w:drawing>
-      </w:r>
-      <w:r>
-        <w:rPr>
-          <w:noProof/>
-        </w:rPr>
-        <w:drawing>
-          <wp:anchor distT="0" distB="0" distL="114300" distR="114300" simplePos="0" relativeHeight="251662336" behindDoc="1" locked="0" layoutInCell="1" allowOverlap="1" wp14:anchorId="0F6F0981" wp14:editId="0077A71E">
-            <wp:simplePos x="0" y="0"/>
-            <wp:positionH relativeFrom="column">
-              <wp:posOffset>-409575</wp:posOffset>
-            </wp:positionH>
-            <wp:positionV relativeFrom="paragraph">
-              <wp:posOffset>-552450</wp:posOffset>
-            </wp:positionV>
-            <wp:extent cx="1799590" cy="1799590"/>
-            <wp:effectExtent l="0" t="0" r="0" b="0"/>
-            <wp:wrapNone/>
-            <wp:docPr id="1710969230" name="Picture 1" descr="The image depicts a stark, minimalistic design with black and white geometric shapes arranged in a fragmented, abstract pattern.&#10;&#10;AI-generated content may be incorrect."/>
-            <wp:cNvGraphicFramePr>
-              <a:graphicFrameLocks xmlns:a="http://schemas.openxmlformats.org/drawingml/2006/main" noChangeAspect="1"/>
-            </wp:cNvGraphicFramePr>
-            <a:graphic xmlns:a="http://schemas.openxmlformats.org/drawingml/2006/main">
-              <a:graphicData uri="http://schemas.openxmlformats.org/drawingml/2006/picture">
-                <pic:pic xmlns:pic="http://schemas.openxmlformats.org/drawingml/2006/picture">
-                  <pic:nvPicPr>
-                    <pic:cNvPr id="1710969230" name="Picture 1" descr="The image depicts a stark, minimalistic design with black and white geometric shapes arranged in a fragmented, abstract pattern.&#10;&#10;AI-generated content may be incorrect."/>
-                    <pic:cNvPicPr/>
-                  </pic:nvPicPr>
-                  <pic:blipFill>
-                    <a:blip r:embed="rId11">
-                      <a:extLst>
-                        <a:ext uri="{28A0092B-C50C-407E-A947-70E740481C1C}">
-                          <a14:useLocalDpi xmlns:a14="http://schemas.microsoft.com/office/drawing/2010/main" val="0"/>
-                        </a:ext>
-                      </a:extLst>
-                    </a:blip>
-                    <a:stretch>
-                      <a:fillRect/>
-                    </a:stretch>
-                  </pic:blipFill>
-                  <pic:spPr>
-                    <a:xfrm>
-                      <a:off x="0" y="0"/>
-                      <a:ext cx="1799590" cy="1799590"/>
-                    </a:xfrm>
-                    <a:prstGeom prst="rect">
-                      <a:avLst/>
-                    </a:prstGeom>
-                  </pic:spPr>
-                </pic:pic>
-              </a:graphicData>
-            </a:graphic>
-            <wp14:sizeRelH relativeFrom="page">
-              <wp14:pctWidth>0</wp14:pctWidth>
-            </wp14:sizeRelH>
-            <wp14:sizeRelV relativeFrom="page">
-              <wp14:pctHeight>0</wp14:pctHeight>
-            </wp14:sizeRelV>
-          </wp:anchor>
-        </w:drawing>
-      </w:r>
     </w:p>
     <w:sectPr>
-      <w:pgSz w:w="11906" w:h="16838"/>
+      <w:pgSz w:w="16838" w:h="11906" w:orient="landscape" w:code="9"/>
       <w:pgMar w:top="1440" w:right="1440" w:bottom="1440" w:left="1440" w:header="708" w:footer="708" w:gutter="0"/>
       <w:cols w:space="708"/>
       <w:docGrid w:linePitch="360"/>
@@ -1937,4 +1937,16 @@
     </a:ext>
   </a:extLst>
 </a:theme>
+</file>
+
+<file path=customXml/item1.xml><?xml version="1.0" encoding="utf-8"?>
+<b:Sources xmlns:b="http://schemas.openxmlformats.org/officeDocument/2006/bibliography" xmlns="http://schemas.openxmlformats.org/officeDocument/2006/bibliography" SelectedStyle="\APASixthEditionOfficeOnline.xsl" StyleName="APA" Version="6"/>
+</file>
+
+<file path=customXml/itemProps1.xml><?xml version="1.0" encoding="utf-8"?>
+<ds:datastoreItem xmlns:ds="http://schemas.openxmlformats.org/officeDocument/2006/customXml" ds:itemID="{FBBBF1FE-8BEB-41C4-B46F-385FC14D8994}">
+  <ds:schemaRefs>
+    <ds:schemaRef ds:uri="http://schemas.openxmlformats.org/officeDocument/2006/bibliography"/>
+  </ds:schemaRefs>
+</ds:datastoreItem>
 </file>
</xml_diff>